<commit_message>
Promote RA-001 Version 2.0 (34 pp); INV-002 re-rendered with the study-event wording and the corrected lookup of PD-005-02 (annex 1052/1052)
Co-Authored-By: Claude Opus 5.5 <noreply@anthropic.com>
</commit_message>
<xml_diff>
--- a/pc_package/INV-002_model_adequacy.docx
+++ b/pc_package/INV-002_model_adequacy.docx
@@ -3225,7 +3225,7 @@
         <w:pStyle w:val="BodyText"/>
       </w:pPr>
       <w:r>
-        <w:t xml:space="preserve">This investigation applies the first three criteria as tests, because they decide whether a model of a design of this size can be adequate at all. The fourth criterion is judged by each step report for its own models. The Protein A report (PCR-005) Version 2.0, for example, is to record its analysis of influential runs as discrepancy PD-005-02. In this document a model is called adequate when it meets the three tests. The re-analysis applied the three tests to the full quadratic model of every output in scope, on the planned runs. The re-analysis fitted Protein A response-surface run 23 at its design elution buffer pH, as Version 1.0 had fitted it.</w:t>
+        <w:t xml:space="preserve">This investigation applies the first three criteria as tests, because they decide whether a model of a design of this size can be adequate at all. The fourth criterion is judged by each step report for its own models. The Protein A report (PCR-005) Version 2.0, for example, records as discrepancy PD-005-02 that some of its conclusions rest on models that do not meet the fourth criterion. In this document a model is called adequate when it meets the three tests. The re-analysis applied the three tests to the full quadratic model of every output in scope, on the planned runs. The re-analysis fitted Protein A response-surface run 23 at its design elution buffer pH, as Version 1.0 had fitted it.</w:t>
       </w:r>
     </w:p>
     <w:p>
@@ -6219,7 +6219,7 @@
         <w:pStyle w:val="BodyText"/>
       </w:pPr>
       <w:r>
-        <w:t xml:space="preserve">The Version 2.0 analysis puts Protein A response-surface run 23 at the elution buffer pH recorded under deviation DEV-005-01, 3.38 instead of the design pH of 3.55 (discrepancy PD-005-03). With run 23 at its recorded pH, the full quadratic model of pool host cell protein fails the lack-of-fit test (p = 0.024), while it meets the model F-test and the limit on overfitting. With run 23 at either pH, the same 14 models fail the limit on overfitting. The selected model of pool host cell protein, fitted with run 23 at its recorded pH, is the one</w:t>
+        <w:t xml:space="preserve">The Version 2.0 analysis puts Protein A response-surface run 23 at the elution buffer pH recorded under study event DEV-005-01, 3.38 instead of the design pH of 3.55 (discrepancy PD-005-03). With run 23 at its recorded pH, the full quadratic model of pool host cell protein fails the lack-of-fit test (p = 0.024), while it meets the model F-test and the limit on overfitting. With run 23 at either pH, the same 14 models fail the limit on overfitting. The selected model of pool host cell protein, fitted with run 23 at its recorded pH, is the one</w:t>
       </w:r>
       <w:r>
         <w:t xml:space="preserve"> </w:t>
@@ -14760,7 +14760,7 @@
         <w:pStyle w:val="FirstParagraph"/>
       </w:pPr>
       <w:r>
-        <w:t xml:space="preserve">Host cell protein in the Protein A pool shows what the log scale does. Every model of pool host cell protein in this section puts response-surface run 23 at the elution buffer pH recorded under deviation DEV-005-01, as the Version 2.0 analysis does (discrepancy PD-005-03). On the log scale the selected model has the form</w:t>
+        <w:t xml:space="preserve">Host cell protein in the Protein A pool shows what the log scale does. Every model of pool host cell protein in this section puts response-surface run 23 at the elution buffer pH recorded under study event DEV-005-01, as the Version 2.0 analysis does (discrepancy PD-005-03). On the log scale the selected model has the form</w:t>
       </w:r>
     </w:p>
     <w:p>
@@ -18609,7 +18609,7 @@
                     <w:jc w:val="center"/>
                   </w:pPr>
                   <w:r>
-                    <w:t xml:space="preserve">Scale: the scale chosen by the Box-Cox profile of the full quadratic. Terms: the terms of the selected model besides the intercept and the block term. Runs: every run in which the output was measured, planned and augmentation runs. F-test p: the p-value of the model F-test, with a dash where the model has no term and so no F-test. n.t.: not testable, because the model reproduces every run and has no residual. Verdict: adequate when the model meets the three tests of PCMP-001 §7.2 that this investigation applies, a significant model F-test (α = 0.05), no significant lack of fit (α = 0.05) and R² minus predicted R² of at most 0.20, on the scale of the model. R² minus predicted R² is calculated before rounding. Protein A response-surface run 23 is at the elution buffer pH recorded under deviation DEV-005-01.</w:t>
+                    <w:t xml:space="preserve">Scale: the scale chosen by the Box-Cox profile of the full quadratic. Terms: the terms of the selected model besides the intercept and the block term. Runs: every run in which the output was measured, planned and augmentation runs. F-test p: the p-value of the model F-test, with a dash where the model has no term and so no F-test. n.t.: not testable, because the model reproduces every run and has no residual. Verdict: adequate when the model meets the three tests of PCMP-001 §7.2 that this investigation applies, a significant model F-test (α = 0.05), no significant lack of fit (α = 0.05) and R² minus predicted R² of at most 0.20, on the scale of the model. R² minus predicted R² is calculated before rounding. Protein A response-surface run 23 is at the elution buffer pH recorded under study event DEV-005-01.</w:t>
                   </w:r>
                 </w:p>
               </w:tc>

</xml_diff>